<commit_message>
Name the screenshots by what they show, not by number
The headings read 'Before anything is removed', 'Select emptied', 'Select
refilled', 'Select trimmed', 'After Cancel' and 'Execute after Cancel', so a
reader can follow the sequence without matching numbers to pictures.
</commit_message>
<xml_diff>
--- a/PrepareQuery_Bugs_PS-PQ-05_and_PS-PQ-13.docx
+++ b/PrepareQuery_Bugs_PS-PQ-05_and_PS-PQ-13.docx
@@ -942,7 +942,7 @@
           <w:sz w:val="24"/>
           <w:b/>
         </w:rPr>
-        <w:t xml:space="preserve">[Image #17] — before anything is removed</w:t>
+        <w:t xml:space="preserve">Before anything is removed</w:t>
       </w:r>
     </w:p>
     <w:p>
@@ -1037,7 +1037,7 @@
           <w:sz w:val="24"/>
           <w:b/>
         </w:rPr>
-        <w:t xml:space="preserve">[Image #15] — the intermediate state, which is correct</w:t>
+        <w:t xml:space="preserve">Select emptied — the intermediate state, which is correct</w:t>
       </w:r>
     </w:p>
     <w:p>
@@ -1118,7 +1118,7 @@
           <w:sz w:val="24"/>
           <w:b/>
         </w:rPr>
-        <w:t xml:space="preserve">[Image #14] — the broken end state</w:t>
+        <w:t xml:space="preserve">Select refilled — the broken end state</w:t>
       </w:r>
     </w:p>
     <w:p>
@@ -1211,7 +1211,7 @@
         <w:rPr>
           <w:sz w:val="22"/>
         </w:rPr>
-        <w:t xml:space="preserve">In all three screenshots the date range and the results table below are unaffected, so the page itself is healthy — only the query controls are stuck.</w:t>
+        <w:t xml:space="preserve">In every screenshot the date range and the results table below are unaffected, so the page itself is healthy — only the query controls are stuck.</w:t>
       </w:r>
     </w:p>
     <w:p>
@@ -1948,7 +1948,7 @@
           <w:sz w:val="24"/>
           <w:b/>
         </w:rPr>
-        <w:t xml:space="preserve">[Image #20] — Select trimmed, request correct</w:t>
+        <w:t xml:space="preserve">Select trimmed — request correct</w:t>
       </w:r>
     </w:p>
     <w:p>
@@ -2030,7 +2030,7 @@
           <w:sz w:val="24"/>
           <w:b/>
         </w:rPr>
-        <w:t xml:space="preserve">[Image #21] — after Cancel, request still correct</w:t>
+        <w:t xml:space="preserve">After Cancel — request still correct</w:t>
       </w:r>
     </w:p>
     <w:p>
@@ -2098,7 +2098,7 @@
           <w:sz w:val="24"/>
           <w:b/>
         </w:rPr>
-        <w:t xml:space="preserve">[Image #22] — Execute after Cancel, request wrong</w:t>
+        <w:t xml:space="preserve">Execute after Cancel — request wrong</w:t>
       </w:r>
     </w:p>
     <w:p>
@@ -2383,7 +2383,7 @@
         <w:rPr>
           <w:sz w:val="22"/>
         </w:rPr>
-        <w:t xml:space="preserve"> against the panel's order of Funding Method, Funding Category, Channel, Displayed Fee Amount. A correct request follows the panel order, as [Image #21] does. That points at the field list being rebuilt from some other collection which kept a stale membership and lost the ordering, rather than Cancel failing to clear a flag.</w:t>
+        <w:t xml:space="preserve"> against the panel's order of Funding Method, Funding Category, Channel, Displayed Fee Amount. A correct request follows the panel order, as the request straight after Cancel does. That points at the field list being rebuilt from some other collection which kept a stale membership and lost the ordering, rather than Cancel failing to clear a flag.</w:t>
       </w:r>
     </w:p>
     <w:p>

</xml_diff>